<commit_message>
Deploy preview for PR 30 🛫
</commit_message>
<xml_diff>
--- a/pr-preview/pr-30/chapters/chapter1-tracked-changes.docx
+++ b/pr-preview/pr-30/chapters/chapter1-tracked-changes.docx
@@ -383,7 +383,7 @@
       </w:r>
     </w:p>
     <w:bookmarkEnd w:id="12"/>
-    <w:bookmarkStart w:id="13" w:name="section-1.3"/>
+    <w:bookmarkStart w:id="14" w:name="section-1.3"/>
     <w:p>
       <w:pPr>
         <w:pStyle w:val="Heading1"/>
@@ -434,6 +434,42 @@
       <w:pPr>
         <w:pStyle w:val="BodyText"/>
       </w:pPr>
+      <w:ins w:id="1017" w:author="PR Preview" w:date="2024-01-01T00:00:00Z">
+        <w:r>
+          <w:t xml:space="preserve">You can also add theorem-style divs:</w:t>
+        </w:r>
+      </w:ins>
+    </w:p>
+    <w:bookmarkStart w:id="13" w:name="thm-sample"/>
+    <w:p>
+      <w:pPr>
+        <w:pStyle w:val="BodyText"/>
+      </w:pPr>
+      <w:ins w:id="1018" w:author="PR Preview" w:date="2024-01-01T00:00:00Z">
+        <w:r>
+          <w:rPr>
+            <w:b/>
+            <w:bCs/>
+          </w:rPr>
+          <w:t xml:space="preserve">Theorem 1</w:t>
+        </w:r>
+      </w:ins>
+      <w:ins w:id="1018" w:author="PR Preview" w:date="2024-01-01T00:00:00Z">
+        <w:r>
+          <w:t xml:space="preserve"> </w:t>
+        </w:r>
+      </w:ins>
+      <w:ins w:id="1018" w:author="PR Preview" w:date="2024-01-01T00:00:00Z">
+        <w:r>
+          <w:t xml:space="preserve">This is a sample theorem block with an ID.</w:t>
+        </w:r>
+      </w:ins>
+    </w:p>
+    <w:bookmarkEnd w:id="13"/>
+    <w:p>
+      <w:pPr>
+        <w:pStyle w:val="BodyText"/>
+      </w:pPr>
       <w:r>
         <w:t xml:space="preserve">I’m adding some new content here:</w:t>
       </w:r>
@@ -482,8 +518,8 @@
         <w:t xml:space="preserve">#&gt; [1] 2</w:t>
       </w:r>
     </w:p>
-    <w:bookmarkEnd w:id="13"/>
-    <w:bookmarkStart w:id="15" w:name="references"/>
+    <w:bookmarkEnd w:id="14"/>
+    <w:bookmarkStart w:id="16" w:name="references"/>
     <w:p>
       <w:pPr>
         <w:pStyle w:val="Heading1"/>
@@ -492,9 +528,9 @@
         <w:t xml:space="preserve">References</w:t>
       </w:r>
     </w:p>
-    <w:bookmarkStart w:id="14" w:name="refs"/>
-    <w:bookmarkEnd w:id="14"/>
+    <w:bookmarkStart w:id="15" w:name="refs"/>
     <w:bookmarkEnd w:id="15"/>
+    <w:bookmarkEnd w:id="16"/>
     <w:sectPr>
       <w:footnotePr>
         <w:numRestart w:val="eachSect"/>

</xml_diff>